<commit_message>
docs: add L3 trust-layer architecture diagram + sync design doc
- new diagrams/trust-layers.svg: L1 密码学 / L2 身份 / L3 领域验证 三层模型，
  含 EvaluationRun 评测证据闭环（三元组 → SHA-256 结果哈希 → 上链 → 验证徽标）
- 应用设计文档（.md + .docx）同步：新增 §5.6 模型质量验证（L3）并嵌入图 4；
  数据模型补 evaluation_runs 表与 model_records / datasets / training_jobs 新列；
  API 概览补 model-records 评测端点；链事件、已知边界、版本号(v1.1)、Flyway V1–V16 更新
</commit_message>
<xml_diff>
--- a/docs/BrainWeb3应用设计文档.docx
+++ b/docs/BrainWeb3应用设计文档.docx
@@ -63,7 +63,7 @@
           <w:sz w:val="20"/>
           <w:szCs w:val="20"/>
         </w:rPr>
-        <w:t xml:space="preserve">版本 v1.0　·　2026 年 6 月　·　文档状态：模拟验收阶段，公开演示环境已上线</w:t>
+        <w:t xml:space="preserve">版本 v1.1　·　2026 年 6 月　·　文档状态：模拟验收阶段，公开演示环境已上线</w:t>
       </w:r>
     </w:p>
     <w:p>
@@ -271,15 +271,43 @@
           <w:sz w:val="21"/>
           <w:szCs w:val="21"/>
         </w:rPr>
-        <w:t xml:space="preserve">联邦训练</w:t>
-      </w:r>
-      <w:r>
-        <w:rPr>
-          <w:rFonts w:ascii="Microsoft YaHei" w:cs="Microsoft YaHei" w:eastAsia="Microsoft YaHei" w:hAnsi="Microsoft YaHei"/>
-          <w:sz w:val="21"/>
-          <w:szCs w:val="21"/>
-        </w:rPr>
-        <w:t xml:space="preserve">：在已授权数据集上发起训练任务，产出可治理的模型版本。</w:t>
+        <w:t xml:space="preserve">神经解码训练</w:t>
+      </w:r>
+      <w:r>
+        <w:rPr>
+          <w:rFonts w:ascii="Microsoft YaHei" w:cs="Microsoft YaHei" w:eastAsia="Microsoft YaHei" w:hAnsi="Microsoft YaHei"/>
+          <w:sz w:val="21"/>
+          <w:szCs w:val="21"/>
+        </w:rPr>
+        <w:t xml:space="preserve">：在已授权数据集上发起解码训练任务（运动想象 / 步态康复 / 语言解码等范式），产出可治理的模型版本。</w:t>
+      </w:r>
+    </w:p>
+    <w:p>
+      <w:pPr>
+        <w:pStyle w:val="ListParagraph"/>
+        <w:numPr>
+          <w:ilvl w:val="0"/>
+          <w:numId w:val="2"/>
+        </w:numPr>
+        <w:spacing w:after="50" w:line="280"/>
+      </w:pPr>
+      <w:r>
+        <w:rPr>
+          <w:rFonts w:ascii="Microsoft YaHei" w:cs="Microsoft YaHei" w:eastAsia="Microsoft YaHei" w:hAnsi="Microsoft YaHei"/>
+          <w:b/>
+          <w:bCs/>
+          <w:sz w:val="21"/>
+          <w:szCs w:val="21"/>
+        </w:rPr>
+        <w:t xml:space="preserve">模型质量验证（L3 领域验证）</w:t>
+      </w:r>
+      <w:r>
+        <w:rPr>
+          <w:rFonts w:ascii="Microsoft YaHei" w:cs="Microsoft YaHei" w:eastAsia="Microsoft YaHei" w:hAnsi="Microsoft YaHei"/>
+          <w:sz w:val="21"/>
+          <w:szCs w:val="21"/>
+        </w:rPr>
+        <w:t xml:space="preserve">：为模型登记可验证的评测证据——测试集/评测脚本指纹 × 指标 → SHA-256 结果哈希 → 锚定上链，按评测方身份给出「自报 / 第三方已验证」徽标。</w:t>
       </w:r>
     </w:p>
     <w:p>
@@ -1140,7 +1168,7 @@
                 <w:sz w:val="18"/>
                 <w:szCs w:val="18"/>
               </w:rPr>
-              <w:t xml:space="preserve">业务持久化（JPA + Flyway V1–V14）</w:t>
+              <w:t xml:space="preserve">业务持久化（JPA + Flyway V1–V16）</w:t>
             </w:r>
           </w:p>
         </w:tc>
@@ -2174,7 +2202,7 @@
           <w:sz w:val="21"/>
           <w:szCs w:val="21"/>
         </w:rPr>
-        <w:t xml:space="preserve">：Spring Boot 3.3.5（Java 17）、Spring Data JPA / Hibernate 6.5、Flyway（V1–V14）、Spring Security + JJWT 0.12、FISCO BCOS Java SDK 3.6.0、MinIO SDK 8.5、Actuator。</w:t>
+        <w:t xml:space="preserve">：Spring Boot 3.3.5（Java 17）、Spring Data JPA / Hibernate 6.5、Flyway（V1–V16）、Spring Security + JJWT 0.12、FISCO BCOS Java SDK 3.6.0、MinIO SDK 8.5、Actuator。</w:t>
       </w:r>
     </w:p>
     <w:p>
@@ -4883,7 +4911,7 @@
           <w:sz w:val="21"/>
           <w:szCs w:val="21"/>
         </w:rPr>
-        <w:t xml:space="preserve">：其余事件类型的默认回退。</w:t>
+        <w:t xml:space="preserve">：MODEL_EVALUATED（评测证据，未列入配置 → 默认回退 optional，仍会锚定）及其余事件类型的默认回退。</w:t>
       </w:r>
     </w:p>
     <w:p>
@@ -5083,6 +5111,319 @@
           <w:szCs w:val="21"/>
         </w:rPr>
         <w:t xml:space="preserve">；IPFS CID 与 off-chain 引用随存证回执返回。</w:t>
+      </w:r>
+    </w:p>
+    <w:p>
+      <w:pPr>
+        <w:pStyle w:val="Heading2"/>
+      </w:pPr>
+      <w:r>
+        <w:rPr>
+          <w:rFonts w:ascii="Microsoft YaHei" w:cs="Microsoft YaHei" w:eastAsia="Microsoft YaHei" w:hAnsi="Microsoft YaHei"/>
+        </w:rPr>
+        <w:t xml:space="preserve">5.6 模型质量验证（L3 领域验证证据）</w:t>
+      </w:r>
+    </w:p>
+    <w:p>
+      <w:pPr>
+        <w:spacing w:after="120" w:line="300"/>
+      </w:pPr>
+      <w:r>
+        <w:rPr>
+          <w:rFonts w:ascii="Microsoft YaHei" w:cs="Microsoft YaHei" w:eastAsia="Microsoft YaHei" w:hAnsi="Microsoft YaHei"/>
+          <w:sz w:val="21"/>
+          <w:szCs w:val="21"/>
+        </w:rPr>
+        <w:t xml:space="preserve">区块链与 DID/VC 默认只解决两层「权威性」：</w:t>
+      </w:r>
+      <w:r>
+        <w:rPr>
+          <w:rFonts w:ascii="Microsoft YaHei" w:cs="Microsoft YaHei" w:eastAsia="Microsoft YaHei" w:hAnsi="Microsoft YaHei"/>
+          <w:b/>
+          <w:bCs/>
+          <w:sz w:val="21"/>
+          <w:szCs w:val="21"/>
+        </w:rPr>
+        <w:t xml:space="preserve">L1 密码学</w:t>
+      </w:r>
+      <w:r>
+        <w:rPr>
+          <w:rFonts w:ascii="Microsoft YaHei" w:cs="Microsoft YaHei" w:eastAsia="Microsoft YaHei" w:hAnsi="Microsoft YaHei"/>
+          <w:sz w:val="21"/>
+          <w:szCs w:val="21"/>
+        </w:rPr>
+        <w:t xml:space="preserve">（没篡改 / 归属清楚 / 转移有效）与 </w:t>
+      </w:r>
+      <w:r>
+        <w:rPr>
+          <w:rFonts w:ascii="Microsoft YaHei" w:cs="Microsoft YaHei" w:eastAsia="Microsoft YaHei" w:hAnsi="Microsoft YaHei"/>
+          <w:b/>
+          <w:bCs/>
+          <w:sz w:val="21"/>
+          <w:szCs w:val="21"/>
+        </w:rPr>
+        <w:t xml:space="preserve">L2 身份/信誉</w:t>
+      </w:r>
+      <w:r>
+        <w:rPr>
+          <w:rFonts w:ascii="Microsoft YaHei" w:cs="Microsoft YaHei" w:eastAsia="Microsoft YaHei" w:hAnsi="Microsoft YaHei"/>
+          <w:sz w:val="21"/>
+          <w:szCs w:val="21"/>
+        </w:rPr>
+        <w:t xml:space="preserve">（谁发布、谁评测、凭证是否有效）。而「这个模型是否真的像宣称的那样好」属于 </w:t>
+      </w:r>
+      <w:r>
+        <w:rPr>
+          <w:rFonts w:ascii="Microsoft YaHei" w:cs="Microsoft YaHei" w:eastAsia="Microsoft YaHei" w:hAnsi="Microsoft YaHei"/>
+          <w:b/>
+          <w:bCs/>
+          <w:sz w:val="21"/>
+          <w:szCs w:val="21"/>
+        </w:rPr>
+        <w:t xml:space="preserve">L3 领域验证</w:t>
+      </w:r>
+      <w:r>
+        <w:rPr>
+          <w:rFonts w:ascii="Microsoft YaHei" w:cs="Microsoft YaHei" w:eastAsia="Microsoft YaHei" w:hAnsi="Microsoft YaHei"/>
+          <w:sz w:val="21"/>
+          <w:szCs w:val="21"/>
+        </w:rPr>
+        <w:t xml:space="preserve">——它不会因为「上链」就自动成立，必须把可验证材料（固定测试集、评测脚本、可复现结果、第三方签名）显式锚定到链上。</w:t>
+      </w:r>
+    </w:p>
+    <w:p>
+      <w:pPr>
+        <w:spacing w:after="40" w:before="100"/>
+        <w:jc w:val="center"/>
+      </w:pPr>
+      <w:r>
+        <w:drawing>
+          <wp:inline distT="0" distB="0" distL="0" distR="0">
+            <wp:extent cx="5905500" cy="4029075"/>
+            <wp:effectExtent t="0" r="0" b="0" l="0"/>
+            <wp:docPr id="1" name="trust-layers" descr="图 4 · 资产权威性三层模型与 L3 评测证据闭环" title="图 4 · 资产权威性三层模型与 L3 评测证据闭环"/>
+            <wp:cNvGraphicFramePr>
+              <a:graphicFrameLocks xmlns:a="http://schemas.openxmlformats.org/drawingml/2006/main" noChangeAspect="1"/>
+            </wp:cNvGraphicFramePr>
+            <a:graphic xmlns:a="http://schemas.openxmlformats.org/drawingml/2006/main">
+              <a:graphicData uri="http://schemas.openxmlformats.org/drawingml/2006/picture">
+                <pic:pic xmlns:pic="http://schemas.openxmlformats.org/drawingml/2006/picture">
+                  <pic:nvPicPr>
+                    <pic:cNvPr id="0" name="" descr=""/>
+                    <pic:cNvPicPr>
+                      <a:picLocks noChangeAspect="1" noChangeArrowheads="1"/>
+                    </pic:cNvPicPr>
+                  </pic:nvPicPr>
+                  <pic:blipFill>
+                    <a:blip r:embed="rId15" cstate="none">
+                      <a:extLst>
+                        <a:ext uri="{96DAC541-7B7A-43D3-8B79-37D633B846F1}">
+                          <asvg:svgBlip xmlns:asvg="http://schemas.microsoft.com/office/drawing/2016/SVG/main" r:embed="rId14"/>
+                        </a:ext>
+                      </a:extLst>
+                    </a:blip>
+                    <a:srcRect/>
+                    <a:stretch>
+                      <a:fillRect/>
+                    </a:stretch>
+                  </pic:blipFill>
+                  <pic:spPr bwMode="auto">
+                    <a:xfrm>
+                      <a:off x="0" y="0"/>
+                      <a:ext cx="5905500" cy="4029075"/>
+                    </a:xfrm>
+                    <a:prstGeom prst="rect">
+                      <a:avLst/>
+                    </a:prstGeom>
+                  </pic:spPr>
+                </pic:pic>
+              </a:graphicData>
+            </a:graphic>
+          </wp:inline>
+        </w:drawing>
+      </w:r>
+    </w:p>
+    <w:p>
+      <w:pPr>
+        <w:spacing w:after="180"/>
+        <w:jc w:val="center"/>
+      </w:pPr>
+      <w:r>
+        <w:rPr>
+          <w:rFonts w:ascii="Microsoft YaHei" w:cs="Microsoft YaHei" w:eastAsia="Microsoft YaHei" w:hAnsi="Microsoft YaHei"/>
+          <w:i/>
+          <w:iCs/>
+          <w:color w:val="64748B"/>
+          <w:sz w:val="18"/>
+          <w:szCs w:val="18"/>
+        </w:rPr>
+        <w:t xml:space="preserve">图 4 · 资产权威性三层模型与 L3 评测证据闭环</w:t>
+      </w:r>
+    </w:p>
+    <w:p>
+      <w:pPr>
+        <w:spacing w:after="120" w:line="300"/>
+      </w:pPr>
+      <w:r>
+        <w:rPr>
+          <w:rFonts w:ascii="Microsoft YaHei" w:cs="Microsoft YaHei" w:eastAsia="Microsoft YaHei" w:hAnsi="Microsoft YaHei"/>
+          <w:sz w:val="21"/>
+          <w:szCs w:val="21"/>
+        </w:rPr>
+        <w:t xml:space="preserve">本系统以 </w:t>
+      </w:r>
+      <w:r>
+        <w:rPr>
+          <w:rFonts w:ascii="Microsoft YaHei" w:cs="Microsoft YaHei" w:eastAsia="Microsoft YaHei" w:hAnsi="Microsoft YaHei"/>
+          <w:b/>
+          <w:bCs/>
+          <w:sz w:val="21"/>
+          <w:szCs w:val="21"/>
+        </w:rPr>
+        <w:t xml:space="preserve">EvaluationRun（评测证据）</w:t>
+      </w:r>
+      <w:r>
+        <w:rPr>
+          <w:rFonts w:ascii="Microsoft YaHei" w:cs="Microsoft YaHei" w:eastAsia="Microsoft YaHei" w:hAnsi="Microsoft YaHei"/>
+          <w:sz w:val="21"/>
+          <w:szCs w:val="21"/>
+        </w:rPr>
+        <w:t xml:space="preserve"> 落地 L3 的最小闭环：</w:t>
+      </w:r>
+    </w:p>
+    <w:p>
+      <w:pPr>
+        <w:pStyle w:val="ListParagraph"/>
+        <w:numPr>
+          <w:ilvl w:val="0"/>
+          <w:numId w:val="3"/>
+        </w:numPr>
+        <w:spacing w:after="50" w:line="280"/>
+      </w:pPr>
+      <w:r>
+        <w:rPr>
+          <w:rFonts w:ascii="Microsoft YaHei" w:cs="Microsoft YaHei" w:eastAsia="Microsoft YaHei" w:hAnsi="Microsoft YaHei"/>
+          <w:b/>
+          <w:bCs/>
+          <w:sz w:val="21"/>
+          <w:szCs w:val="21"/>
+        </w:rPr>
+        <w:t xml:space="preserve">评测三元组</w:t>
+      </w:r>
+      <w:r>
+        <w:rPr>
+          <w:rFonts w:ascii="Microsoft YaHei" w:cs="Microsoft YaHei" w:eastAsia="Microsoft YaHei" w:hAnsi="Microsoft YaHei"/>
+          <w:sz w:val="21"/>
+          <w:szCs w:val="21"/>
+        </w:rPr>
+        <w:t xml:space="preserve">：testSetHash（测试集指纹）× evalScriptHash（评测脚本指纹）× metricsJson（指标），各自留 provenance。</w:t>
+      </w:r>
+    </w:p>
+    <w:p>
+      <w:pPr>
+        <w:pStyle w:val="ListParagraph"/>
+        <w:numPr>
+          <w:ilvl w:val="0"/>
+          <w:numId w:val="3"/>
+        </w:numPr>
+        <w:spacing w:after="50" w:line="280"/>
+      </w:pPr>
+      <w:r>
+        <w:rPr>
+          <w:rFonts w:ascii="Microsoft YaHei" w:cs="Microsoft YaHei" w:eastAsia="Microsoft YaHei" w:hAnsi="Microsoft YaHei"/>
+          <w:b/>
+          <w:bCs/>
+          <w:sz w:val="21"/>
+          <w:szCs w:val="21"/>
+        </w:rPr>
+        <w:t xml:space="preserve">结果哈希</w:t>
+      </w:r>
+      <w:r>
+        <w:rPr>
+          <w:rFonts w:ascii="Microsoft YaHei" w:cs="Microsoft YaHei" w:eastAsia="Microsoft YaHei" w:hAnsi="Microsoft YaHei"/>
+          <w:sz w:val="21"/>
+          <w:szCs w:val="21"/>
+        </w:rPr>
+        <w:t xml:space="preserve">：对「模型 × 数据集 × 测试集 × 脚本 × 指标 × 评测方 × 时间」取 SHA-256 生成 resultHash，使评测结果防篡改、可对账。</w:t>
+      </w:r>
+    </w:p>
+    <w:p>
+      <w:pPr>
+        <w:pStyle w:val="ListParagraph"/>
+        <w:numPr>
+          <w:ilvl w:val="0"/>
+          <w:numId w:val="3"/>
+        </w:numPr>
+        <w:spacing w:after="50" w:line="280"/>
+      </w:pPr>
+      <w:r>
+        <w:rPr>
+          <w:rFonts w:ascii="Microsoft YaHei" w:cs="Microsoft YaHei" w:eastAsia="Microsoft YaHei" w:hAnsi="Microsoft YaHei"/>
+          <w:b/>
+          <w:bCs/>
+          <w:sz w:val="21"/>
+          <w:szCs w:val="21"/>
+        </w:rPr>
+        <w:t xml:space="preserve">锚定上链</w:t>
+      </w:r>
+      <w:r>
+        <w:rPr>
+          <w:rFonts w:ascii="Microsoft YaHei" w:cs="Microsoft YaHei" w:eastAsia="Microsoft YaHei" w:hAnsi="Microsoft YaHei"/>
+          <w:sz w:val="21"/>
+          <w:szCs w:val="21"/>
+        </w:rPr>
+        <w:t xml:space="preserve">：写审计事件 + 触发 MODEL_EVALUATED 链业务记录（默认 optional 策略，仍会锚定，回执含 chainTxHash）。</w:t>
+      </w:r>
+    </w:p>
+    <w:p>
+      <w:pPr>
+        <w:pStyle w:val="ListParagraph"/>
+        <w:numPr>
+          <w:ilvl w:val="0"/>
+          <w:numId w:val="3"/>
+        </w:numPr>
+        <w:spacing w:after="50" w:line="280"/>
+      </w:pPr>
+      <w:r>
+        <w:rPr>
+          <w:rFonts w:ascii="Microsoft YaHei" w:cs="Microsoft YaHei" w:eastAsia="Microsoft YaHei" w:hAnsi="Microsoft YaHei"/>
+          <w:b/>
+          <w:bCs/>
+          <w:sz w:val="21"/>
+          <w:szCs w:val="21"/>
+        </w:rPr>
+        <w:t xml:space="preserve">验证徽标</w:t>
+      </w:r>
+      <w:r>
+        <w:rPr>
+          <w:rFonts w:ascii="Microsoft YaHei" w:cs="Microsoft YaHei" w:eastAsia="Microsoft YaHei" w:hAnsi="Microsoft YaHei"/>
+          <w:sz w:val="21"/>
+          <w:szCs w:val="21"/>
+        </w:rPr>
+        <w:t xml:space="preserve">：按「评测方机构 vs 模型归属机构」自动判级——同机构 = self-reported（自报），不同机构 = third-party-verified（第三方已验证）；ModelRecord.verificationStatus 取各评测中的最高级别（unverified &lt; self-reported &lt; third-party-verified）。</w:t>
+      </w:r>
+    </w:p>
+    <w:p>
+      <w:pPr>
+        <w:spacing w:after="120" w:line="300"/>
+      </w:pPr>
+      <w:r>
+        <w:rPr>
+          <w:rFonts w:ascii="Microsoft YaHei" w:cs="Microsoft YaHei" w:eastAsia="Microsoft YaHei" w:hAnsi="Microsoft YaHei"/>
+          <w:b/>
+          <w:bCs/>
+          <w:sz w:val="21"/>
+          <w:szCs w:val="21"/>
+        </w:rPr>
+        <w:t xml:space="preserve">设计含义</w:t>
+      </w:r>
+      <w:r>
+        <w:rPr>
+          <w:rFonts w:ascii="Microsoft YaHei" w:cs="Microsoft YaHei" w:eastAsia="Microsoft YaHei" w:hAnsi="Microsoft YaHei"/>
+          <w:sz w:val="21"/>
+          <w:szCs w:val="21"/>
+        </w:rPr>
+        <w:t xml:space="preserve">：模型的质量声明不再是一行「自填文本」，而是指向带哈希、带评测方身份、并锚定到链的可验证证据。前端「模型治理」页提供评测证据面板（提交 + 列表）与模型卡验证徽标。</w:t>
       </w:r>
     </w:p>
     <w:p>
@@ -5297,7 +5638,7 @@
                 <w:sz w:val="18"/>
                 <w:szCs w:val="18"/>
               </w:rPr>
-              <w:t xml:space="preserve">subject_code, title, owner_organization, format；upload_status / proof_status / training_readiness / destruction_status；channel/sample_count, duration, sampling_rate；storage_provider/key/uri；proof_fingerprint；destroyed_at/by</w:t>
+              <w:t xml:space="preserve">subject_code, title, owner_organization, format, signal_source(信号源/侵入度档)；upload_status / proof_status / training_readiness / destruction_status；channel/sample_count, duration, sampling_rate；storage_provider/key/uri；proof_fingerprint；destroyed_at/by</w:t>
             </w:r>
           </w:p>
         </w:tc>
@@ -6044,7 +6385,7 @@
                 <w:sz w:val="18"/>
                 <w:szCs w:val="18"/>
               </w:rPr>
-              <w:t xml:space="preserve">dataset_id, orchestrator, algorithm, model_name, objective, requested/completed_rounds, status, external_job_ref, metric_summary</w:t>
+              <w:t xml:space="preserve">dataset_id, orchestrator, algorithm, model_name, objective, decode_paradigm(解码范式), requested/completed_rounds, status, external_job_ref, metric_summary</w:t>
             </w:r>
           </w:p>
         </w:tc>
@@ -6127,7 +6468,7 @@
                 <w:sz w:val="18"/>
                 <w:szCs w:val="18"/>
               </w:rPr>
-              <w:t xml:space="preserve">training_job_id(唯一 1:1), dataset_id, governance_status(candidate/active/archived), artifact_ref, metric_summary, last_governed_by</w:t>
+              <w:t xml:space="preserve">training_job_id(唯一 1:1), dataset_id, governance_status(candidate/active/archived), artifact_ref, metric_summary, last_governed_by, verification_status(unverified/self-reported/third-party-verified), latest_evaluation_id, latest_result_hash</w:t>
             </w:r>
           </w:p>
         </w:tc>
@@ -6156,7 +6497,7 @@
                 <w:sz w:val="18"/>
                 <w:szCs w:val="18"/>
               </w:rPr>
-              <w:t xml:space="preserve">chain_business_records</w:t>
+              <w:t xml:space="preserve">evaluation_runs</w:t>
             </w:r>
           </w:p>
         </w:tc>
@@ -6183,7 +6524,7 @@
                 <w:sz w:val="18"/>
                 <w:szCs w:val="18"/>
               </w:rPr>
-              <w:t xml:space="preserve">id BIGINT</w:t>
+              <w:t xml:space="preserve">id VARCHAR(40)</w:t>
             </w:r>
           </w:p>
         </w:tc>
@@ -6210,7 +6551,7 @@
                 <w:sz w:val="18"/>
                 <w:szCs w:val="18"/>
               </w:rPr>
-              <w:t xml:space="preserve">dataset_id, event_type, reference_id, business_status, anchor_status(pending/anchored/failed/policy-skipped), contract_*, event_hash, chain_tx_hash</w:t>
+              <w:t xml:space="preserve">model_record_id, dataset_id, evaluator_actor_id/role/org, test_set_hash, eval_script_hash, metrics_json, result_hash(SHA-256), verification_status, notes（L3 评测证据，MODEL_EVALUATED 锚定上链）</w:t>
             </w:r>
           </w:p>
         </w:tc>
@@ -6239,7 +6580,7 @@
                 <w:sz w:val="18"/>
                 <w:szCs w:val="18"/>
               </w:rPr>
-              <w:t xml:space="preserve">identity_credential_states</w:t>
+              <w:t xml:space="preserve">chain_business_records</w:t>
             </w:r>
           </w:p>
         </w:tc>
@@ -6293,7 +6634,7 @@
                 <w:sz w:val="18"/>
                 <w:szCs w:val="18"/>
               </w:rPr>
-              <w:t xml:space="preserve">subject_type(user/dataset/model)+subject_key(唯一), credential_status(active/suspended/revoked), updated_by</w:t>
+              <w:t xml:space="preserve">dataset_id, event_type, reference_id, business_status, anchor_status(pending/anchored/failed/policy-skipped), contract_*, event_hash, chain_tx_hash</w:t>
             </w:r>
           </w:p>
         </w:tc>
@@ -6322,7 +6663,7 @@
                 <w:sz w:val="18"/>
                 <w:szCs w:val="18"/>
               </w:rPr>
-              <w:t xml:space="preserve">identity_credential_history</w:t>
+              <w:t xml:space="preserve">identity_credential_states</w:t>
             </w:r>
           </w:p>
         </w:tc>
@@ -6376,7 +6717,7 @@
                 <w:sz w:val="18"/>
                 <w:szCs w:val="18"/>
               </w:rPr>
-              <w:t xml:space="preserve">previous_status→next_status, source(manual/derived/legacy-config), reason（不可变历史）</w:t>
+              <w:t xml:space="preserve">subject_type(user/dataset/model)+subject_key(唯一), credential_status(active/suspended/revoked), updated_by</w:t>
             </w:r>
           </w:p>
         </w:tc>
@@ -6405,6 +6746,89 @@
                 <w:sz w:val="18"/>
                 <w:szCs w:val="18"/>
               </w:rPr>
+              <w:t xml:space="preserve">identity_credential_history</w:t>
+            </w:r>
+          </w:p>
+        </w:tc>
+        <w:tc>
+          <w:tcPr>
+            <w:tcW w:type="dxa" w:w="1900"/>
+            <w:tcBorders>
+              <w:top w:val="single" w:color="D0D7DE" w:sz="1"/>
+              <w:left w:val="single" w:color="D0D7DE" w:sz="1"/>
+              <w:bottom w:val="single" w:color="D0D7DE" w:sz="1"/>
+              <w:right w:val="single" w:color="D0D7DE" w:sz="1"/>
+            </w:tcBorders>
+            <w:tcMar>
+              <w:top w:type="dxa" w:w="50"/>
+              <w:left w:type="dxa" w:w="110"/>
+              <w:bottom w:type="dxa" w:w="50"/>
+              <w:right w:type="dxa" w:w="110"/>
+            </w:tcMar>
+          </w:tcPr>
+          <w:p>
+            <w:r>
+              <w:rPr>
+                <w:rFonts w:ascii="Microsoft YaHei" w:cs="Microsoft YaHei" w:eastAsia="Microsoft YaHei" w:hAnsi="Microsoft YaHei"/>
+                <w:sz w:val="18"/>
+                <w:szCs w:val="18"/>
+              </w:rPr>
+              <w:t xml:space="preserve">id BIGINT</w:t>
+            </w:r>
+          </w:p>
+        </w:tc>
+        <w:tc>
+          <w:tcPr>
+            <w:tcW w:type="dxa" w:w="4826"/>
+            <w:tcBorders>
+              <w:top w:val="single" w:color="D0D7DE" w:sz="1"/>
+              <w:left w:val="single" w:color="D0D7DE" w:sz="1"/>
+              <w:bottom w:val="single" w:color="D0D7DE" w:sz="1"/>
+              <w:right w:val="single" w:color="D0D7DE" w:sz="1"/>
+            </w:tcBorders>
+            <w:tcMar>
+              <w:top w:type="dxa" w:w="50"/>
+              <w:left w:type="dxa" w:w="110"/>
+              <w:bottom w:type="dxa" w:w="50"/>
+              <w:right w:type="dxa" w:w="110"/>
+            </w:tcMar>
+          </w:tcPr>
+          <w:p>
+            <w:r>
+              <w:rPr>
+                <w:rFonts w:ascii="Microsoft YaHei" w:cs="Microsoft YaHei" w:eastAsia="Microsoft YaHei" w:hAnsi="Microsoft YaHei"/>
+                <w:sz w:val="18"/>
+                <w:szCs w:val="18"/>
+              </w:rPr>
+              <w:t xml:space="preserve">previous_status→next_status, source(manual/derived/legacy-config), reason（不可变历史）</w:t>
+            </w:r>
+          </w:p>
+        </w:tc>
+      </w:tr>
+      <w:tr>
+        <w:tc>
+          <w:tcPr>
+            <w:tcW w:type="dxa" w:w="2300"/>
+            <w:tcBorders>
+              <w:top w:val="single" w:color="D0D7DE" w:sz="1"/>
+              <w:left w:val="single" w:color="D0D7DE" w:sz="1"/>
+              <w:bottom w:val="single" w:color="D0D7DE" w:sz="1"/>
+              <w:right w:val="single" w:color="D0D7DE" w:sz="1"/>
+            </w:tcBorders>
+            <w:tcMar>
+              <w:top w:type="dxa" w:w="50"/>
+              <w:left w:type="dxa" w:w="110"/>
+              <w:bottom w:type="dxa" w:w="50"/>
+              <w:right w:type="dxa" w:w="110"/>
+            </w:tcMar>
+          </w:tcPr>
+          <w:p>
+            <w:r>
+              <w:rPr>
+                <w:rFonts w:ascii="Microsoft YaHei" w:cs="Microsoft YaHei" w:eastAsia="Microsoft YaHei" w:hAnsi="Microsoft YaHei"/>
+                <w:sz w:val="18"/>
+                <w:szCs w:val="18"/>
+              </w:rPr>
               <w:t xml:space="preserve">destruction_requests</w:t>
             </w:r>
           </w:p>
@@ -6485,7 +6909,7 @@
           <w:sz w:val="21"/>
           <w:szCs w:val="21"/>
         </w:rPr>
-        <w:t xml:space="preserve">：datasets 与 data_asset_proofs 一对一；datasets 一对多 access_requests / upload_audits / training_jobs / chain_business_records / destruction_requests；training_jobs 与 model_records 一对一；identity_credential_states 一对多 history。</w:t>
+        <w:t xml:space="preserve">：datasets 与 data_asset_proofs 一对一；datasets 一对多 access_requests / upload_audits / training_jobs / chain_business_records / destruction_requests；training_jobs 与 model_records 一对一；model_records 一对多 evaluation_runs；identity_credential_states 一对多 history。</w:t>
       </w:r>
     </w:p>
     <w:p>
@@ -7292,7 +7716,7 @@
                 <w:sz w:val="18"/>
                 <w:szCs w:val="18"/>
               </w:rPr>
-              <w:t xml:space="preserve">GET / · GET /{id} · GET /{id}/governance-lane · PATCH /{id}/governance</w:t>
+              <w:t xml:space="preserve">GET / · GET /{id} · GET /{id}/governance-lane · PATCH /{id}/governance · GET /{id}/evaluations · POST /{id}/evaluations（L3 评测证据）</w:t>
             </w:r>
           </w:p>
         </w:tc>
@@ -8362,6 +8786,34 @@
           <w:szCs w:val="21"/>
         </w:rPr>
         <w:t xml:space="preserve">：federated-service 为占位，MockFederatedTrainingGateway 启发式产出演示指标；后续接 FATE/Flower。</w:t>
+      </w:r>
+    </w:p>
+    <w:p>
+      <w:pPr>
+        <w:pStyle w:val="ListParagraph"/>
+        <w:numPr>
+          <w:ilvl w:val="0"/>
+          <w:numId w:val="2"/>
+        </w:numPr>
+        <w:spacing w:after="50" w:line="280"/>
+      </w:pPr>
+      <w:r>
+        <w:rPr>
+          <w:rFonts w:ascii="Microsoft YaHei" w:cs="Microsoft YaHei" w:eastAsia="Microsoft YaHei" w:hAnsi="Microsoft YaHei"/>
+          <w:b/>
+          <w:bCs/>
+          <w:sz w:val="21"/>
+          <w:szCs w:val="21"/>
+        </w:rPr>
+        <w:t xml:space="preserve">L3 评测证据为最小闭环</w:t>
+      </w:r>
+      <w:r>
+        <w:rPr>
+          <w:rFonts w:ascii="Microsoft YaHei" w:cs="Microsoft YaHei" w:eastAsia="Microsoft YaHei" w:hAnsi="Microsoft YaHei"/>
+          <w:sz w:val="21"/>
+          <w:szCs w:val="21"/>
+        </w:rPr>
+        <w:t xml:space="preserve">：已落地「评测三元组 → 结果哈希 → MODEL_EVALUATED 上链 → 验证徽标」，但指标仍来自占位训练网关；尚缺可复现 eval harness、第三方评测 VC 上链、固定 benchmark 测试集 provenance、zkML/TEE 等更强证据。</w:t>
       </w:r>
     </w:p>
     <w:p>
@@ -8723,6 +9175,12 @@
   </w:num>
   <w:num w:numId="2">
     <w:abstractNumId w:val="2"/>
+    <w:lvlOverride w:ilvl="0">
+      <w:startOverride w:val="1"/>
+    </w:lvlOverride>
+  </w:num>
+  <w:num w:numId="3">
+    <w:abstractNumId w:val="3"/>
     <w:lvlOverride w:ilvl="0">
       <w:startOverride w:val="1"/>
     </w:lvlOverride>

</xml_diff>